<commit_message>
Say what he actually does at his current job
The CV entry for his current role has been a placeholder since it went in -
title, employer, dates, and a bullet that said only "Aberdeen-based technician
work in subsea engineering". Harry has now said what the job is: testing and
repairing subsea cables, connectors and terminations, and moulding cable
assemblies in epoxy resin and polyurethane to marine sealing standards.

Updated the CV entry, the summary, all four tailored PDF summaries in
cv_tailor.py, and CANDIDATE_PROFILE - which feeds every letter the machine
writes and previously described his current work only as "subsea engineering",
undervaluing skills worth naming to an employer directly. The employer is still
never named there, same rule as before: it is nobody else's business, and in a
city this size it gets straight back to them that he is looking.

Co-Authored-By: Claude Sonnet 5 <noreply@anthropic.com>
Claude-Session: https://claude.ai/code/session_01K2QRWn8N7euzwyo48GKcKi
</commit_message>
<xml_diff>
--- a/cv/Harry_Russell_CV.docx
+++ b/cv/Harry_Russell_CV.docx
@@ -58,7 +58,7 @@
           <w:sz w:val="20"/>
           <w:szCs w:val="20"/>
         </w:rPr>
-        <w:t xml:space="preserve">Engineering technician, currently in a technician role in Aberdeen subsea engineering. Three years before that building, testing and fault-finding precision subsea electronics at Sonardyne to IPC-A-610 Class 3, and two years running secure communications and networks in the Royal Navy aboard a frontline Type 23 frigate. Time-served via a completed Engineering Modern Apprenticeship (SCQF Level 7), with first-year BEng (Hons) study in Instrumentation, Measurement &amp; Control. Used to safety-critical kit, hard deadlines and environments where a fault has to be found and fixed with nobody else to call. Looking for a hands-on technical role with travel, across engineering, instrumentation, electronics, field service or communications.</w:t>
+        <w:t xml:space="preserve">Engineering technician, currently testing, repairing and moulding subsea cables and connectors - fault-finding to component and joint level, and potting assemblies in epoxy resin and polyurethane to marine sealing standards. Three years before that building, testing and fault-finding precision subsea electronics at Sonardyne to IPC-A-610 Class 3, and two years running secure communications and networks in the Royal Navy aboard a frontline Type 23 frigate. Time-served via a completed Engineering Modern Apprenticeship (SCQF Level 7), with first-year BEng (Hons) study in Instrumentation, Measurement &amp; Control. Used to safety-critical kit, hard deadlines and environments where a fault has to be found and fixed with nobody else to call. Looking for a hands-on technical role with travel, across engineering, instrumentation, electronics, field service or communications.</w:t>
       </w:r>
     </w:p>
     <w:p>
@@ -210,7 +210,24 @@
           <w:sz w:val="20"/>
           <w:szCs w:val="20"/>
         </w:rPr>
-        <w:t xml:space="preserve">Current role, started August 2026. Aberdeen-based technician work in subsea engineering.</w:t>
+        <w:t xml:space="preserve">Test and repair subsea cables, connectors and terminations, fault-finding to component and joint level.</w:t>
+      </w:r>
+    </w:p>
+    <w:p>
+      <w:pPr>
+        <w:pStyle w:val="ListParagraph"/>
+        <w:numPr>
+          <w:ilvl w:val="0"/>
+          <w:numId w:val="1"/>
+        </w:numPr>
+        <w:spacing w:after="40"/>
+      </w:pPr>
+      <w:r>
+        <w:rPr>
+          <w:sz w:val="20"/>
+          <w:szCs w:val="20"/>
+        </w:rPr>
+        <w:t xml:space="preserve">Mould and pot cable assemblies and connectors using epoxy resin, polyurethane and related compounds to marine sealing standards.</w:t>
       </w:r>
     </w:p>
     <w:p>

</xml_diff>